<commit_message>
Manual: Extend SLA is one list, and an extended stage shows Extended
Administrator and Complete guides (2.6 / 4.6): the new dialog - pick how
much time to add by priority, the priority never changes, overdue time
counts from now, Extended instead of Missed if it finishes in time, else
breached as usual and can be extended again. New Figure 2.6 / 4.6 from the
test site. Common situations no longer points at "Give it more time".
Technician and Complete guides: a late stage shows Extended if an
Administrator extends it and it finishes in time. Glossary in all four
guides gains Extended. Word and PDF, re-exported from Word.

Co-Authored-By: Claude Opus 5.5 <noreply@anthropic.com>
</commit_message>
<xml_diff>
--- a/docs/user-manual/SI_Administrator_Guide.docx
+++ b/docs/user-manual/SI_Administrator_Guide.docx
@@ -722,13 +722,7 @@
         <w:t>raises a work order</w:t>
       </w:r>
       <w:r>
-        <w:t xml:space="preserve">. </w:t>
-      </w:r>
-      <w:r>
-        <w:t>An HOD or Administrator assigns it to a technician</w:t>
-      </w:r>
-      <w:r>
-        <w:t xml:space="preserve">, the technician </w:t>
+        <w:t xml:space="preserve">. An HOD or Administrator assigns it to a technician, the technician </w:t>
       </w:r>
       <w:r>
         <w:rPr>
@@ -1118,21 +1112,7 @@
                 <w:sz w:val="19"/>
                 <w:szCs w:val="19"/>
               </w:rPr>
-              <w:t xml:space="preserve"> roles. </w:t>
-            </w:r>
-            <w:r>
-              <w:rPr>
-                <w:sz w:val="19"/>
-                <w:szCs w:val="19"/>
-              </w:rPr>
-              <w:t>HODs assign technicians and sign off closed work orders, and Supervisors and Managers oversee the work.</w:t>
-            </w:r>
-            <w:r>
-              <w:rPr>
-                <w:sz w:val="19"/>
-                <w:szCs w:val="19"/>
-              </w:rPr>
-              <w:t xml:space="preserve"> One person can hold more than one role — for example Requester + Technician — and then gets everything both roles allow.</w:t>
+              <w:t xml:space="preserve"> roles. HODs assign technicians and sign off closed work orders, and Supervisors and Managers oversee the work. One person can hold more than one role — for example Requester + Technician — and then gets everything both roles allow.</w:t>
             </w:r>
           </w:p>
         </w:tc>
@@ -5228,21 +5208,7 @@
                 <w:sz w:val="18"/>
                 <w:szCs w:val="18"/>
               </w:rPr>
-              <w:t xml:space="preserve">Who the job is assigned to. </w:t>
-            </w:r>
-            <w:r>
-              <w:rPr>
-                <w:sz w:val="18"/>
-                <w:szCs w:val="18"/>
-              </w:rPr>
-              <w:t>HODs and Administrators assign and reassign here</w:t>
-            </w:r>
-            <w:r>
-              <w:rPr>
-                <w:sz w:val="18"/>
-                <w:szCs w:val="18"/>
-              </w:rPr>
-              <w:t>, until the job is completed. After that the Assign buttons are greyed out.</w:t>
+              <w:t xml:space="preserve">Who the job is assigned to. HODs and Administrators assign and reassign here, until the job is completed. After that the Assign buttons are greyed out.</w:t>
             </w:r>
           </w:p>
         </w:tc>
@@ -7376,7 +7342,7 @@
         </w:rPr>
         <w:drawing>
           <wp:inline distT="0" distB="0" distL="0" distR="0" wp14:anchorId="16186A70" wp14:editId="41B81983">
-            <wp:extent cx="3619500" cy="6076950"/>
+            <wp:extent cx="3619500" cy="5561292"/>
             <wp:effectExtent l="19050" t="19050" r="19050" b="19050"/>
             <wp:docPr id="1076513871" name="Picture 1076513871"/>
             <wp:cNvGraphicFramePr>
@@ -7401,7 +7367,7 @@
                   <pic:spPr bwMode="auto">
                     <a:xfrm>
                       <a:off x="0" y="0"/>
-                      <a:ext cx="3619500" cy="6076950"/>
+                      <a:ext cx="3619500" cy="5561292"/>
                     </a:xfrm>
                     <a:prstGeom prst="rect">
                       <a:avLst/>
@@ -7441,7 +7407,7 @@
           <w:sz w:val="16"/>
           <w:szCs w:val="16"/>
         </w:rPr>
-        <w:t xml:space="preserve"> — Extend SLA offers more time at the same priority, or a re-grade to a less urgent one.</w:t>
+        <w:t xml:space="preserve"> — Extend SLA: pick how much time to add. The priority stays the same.</w:t>
       </w:r>
     </w:p>
     <w:p>
@@ -7489,10 +7455,10 @@
           <w:bCs/>
           <w:color w:val="0B1A3A"/>
         </w:rPr>
-        <w:t>Give it more time</w:t>
-      </w:r>
-      <w:r>
-        <w:t xml:space="preserve"> — adds another full stage window at the </w:t>
+        <w:t xml:space="preserve">Pick how much time to add.</w:t>
+      </w:r>
+      <w:r>
+        <w:t xml:space="preserve"> Each option is named by a priority and adds that priority's full time — for example </w:t>
       </w:r>
       <w:r>
         <w:rPr>
@@ -7500,10 +7466,32 @@
           <w:bCs/>
           <w:color w:val="0B1A3A"/>
         </w:rPr>
-        <w:t>same</w:t>
-      </w:r>
-      <w:r>
-        <w:t xml:space="preserve"> priority. Use this when the job is correctly graded but genuinely needs longer. You can do it more than once — SI warns you, in red, how many times it has already been extended.</w:t>
+        <w:t xml:space="preserve">P7</w:t>
+      </w:r>
+      <w:r>
+        <w:t xml:space="preserve"> adds 15 days and </w:t>
+      </w:r>
+      <w:r>
+        <w:rPr>
+          <w:b/>
+          <w:bCs/>
+          <w:color w:val="0B1A3A"/>
+        </w:rPr>
+        <w:t xml:space="preserve">P8</w:t>
+      </w:r>
+      <w:r>
+        <w:t xml:space="preserve"> adds 30 days. The job's own priority is pre-selected, and every option shows its </w:t>
+      </w:r>
+      <w:r>
+        <w:rPr>
+          <w:b/>
+          <w:bCs/>
+          <w:color w:val="0B1A3A"/>
+        </w:rPr>
+        <w:t xml:space="preserve">new deadline</w:t>
+      </w:r>
+      <w:r>
+        <w:t xml:space="preserve">.</w:t>
       </w:r>
     </w:p>
     <w:p>
@@ -7516,15 +7504,18 @@
         <w:spacing w:after="80"/>
       </w:pPr>
       <w:r>
+        <w:t xml:space="preserve">The </w:t>
+      </w:r>
+      <w:r>
         <w:rPr>
           <w:b/>
           <w:bCs/>
           <w:color w:val="0B1A3A"/>
         </w:rPr>
-        <w:t>Re-grade</w:t>
-      </w:r>
-      <w:r>
-        <w:t xml:space="preserve"> — moves the job to a less urgent priority, which gives the current stage that priority's longer window. </w:t>
+        <w:t xml:space="preserve">priority does not change</w:t>
+      </w:r>
+      <w:r>
+        <w:t xml:space="preserve"> — only the stage the job is in gets more time. If the job was graded wrongly, use </w:t>
       </w:r>
       <w:r>
         <w:rPr>
@@ -7532,10 +7523,10 @@
           <w:bCs/>
           <w:color w:val="0B1A3A"/>
         </w:rPr>
-        <w:t>Suggested</w:t>
-      </w:r>
-      <w:r>
-        <w:t xml:space="preserve"> marks the option that best fits.</w:t>
+        <w:t xml:space="preserve">Change priority</w:t>
+      </w:r>
+      <w:r>
+        <w:t xml:space="preserve"> instead.</w:t>
       </w:r>
     </w:p>
     <w:p>
@@ -7548,7 +7539,7 @@
         <w:spacing w:after="80"/>
       </w:pPr>
       <w:r>
-        <w:t xml:space="preserve">Options marked </w:t>
+        <w:t xml:space="preserve">If the stage is already overdue, the time counts </w:t>
       </w:r>
       <w:r>
         <w:rPr>
@@ -7556,10 +7547,10 @@
           <w:bCs/>
           <w:color w:val="0B1A3A"/>
         </w:rPr>
-        <w:t>still overdue</w:t>
-      </w:r>
-      <w:r>
-        <w:t xml:space="preserve"> would still leave the job late.</w:t>
+        <w:t xml:space="preserve">from now</w:t>
+      </w:r>
+      <w:r>
+        <w:t xml:space="preserve">, so the job always gets the full amount you picked.</w:t>
       </w:r>
     </w:p>
     <w:p>
@@ -7580,10 +7571,45 @@
           <w:bCs/>
           <w:color w:val="0B1A3A"/>
         </w:rPr>
-        <w:t>Yes, extend…</w:t>
-      </w:r>
-      <w:r>
-        <w:t xml:space="preserve"> to confirm. It is recorded with your name, and the technician and requester are notified. Stages already missed stay recorded as missed — extending gives time from now on, it does not erase history.</w:t>
+        <w:t xml:space="preserve">Extend by…</w:t>
+      </w:r>
+      <w:r>
+        <w:t xml:space="preserve"> to confirm. The timeline records how much time was added and by whom, and the technician and requester are notified.</w:t>
+      </w:r>
+    </w:p>
+    <w:p>
+      <w:pPr>
+        <w:pStyle w:val="ListParagraph"/>
+        <w:numPr>
+          <w:ilvl w:val="0"/>
+          <w:numId w:val="4"/>
+        </w:numPr>
+        <w:spacing w:after="80"/>
+      </w:pPr>
+      <w:r>
+        <w:t xml:space="preserve">If the job then finishes within the new deadline, its SLA targets show </w:t>
+      </w:r>
+      <w:r>
+        <w:rPr>
+          <w:b/>
+          <w:bCs/>
+          <w:color w:val="0B1A3A"/>
+        </w:rPr>
+        <w:t xml:space="preserve">Extended</w:t>
+      </w:r>
+      <w:r>
+        <w:t xml:space="preserve"> instead of Missed. If it misses the new deadline too, it is </w:t>
+      </w:r>
+      <w:r>
+        <w:rPr>
+          <w:b/>
+          <w:bCs/>
+          <w:color w:val="0B1A3A"/>
+        </w:rPr>
+        <w:t xml:space="preserve">breached as usual</w:t>
+      </w:r>
+      <w:r>
+        <w:t xml:space="preserve"> and can be extended again — from the second time on, SI warns you in red how many times it has been extended.</w:t>
       </w:r>
     </w:p>
     <w:p>
@@ -7794,10 +7820,7 @@
         <w:t>Delete permanently</w:t>
       </w:r>
       <w:r>
-        <w:t xml:space="preserve">. By default only Administrators can delete. </w:t>
-      </w:r>
-      <w:r>
-        <w:t xml:space="preserve">The </w:t>
+        <w:t xml:space="preserve">. By default only Administrators can delete. The </w:t>
       </w:r>
       <w:r>
         <w:rPr>
@@ -7806,10 +7829,7 @@
         <w:t>★</w:t>
       </w:r>
       <w:r>
-        <w:t xml:space="preserve"> app developer can allow</w:t>
-      </w:r>
-      <w:r>
-        <w:t xml:space="preserve"> other roles in </w:t>
+        <w:t xml:space="preserve"> app developer can allow other roles in </w:t>
       </w:r>
       <w:r>
         <w:rPr>
@@ -8419,35 +8439,7 @@
                 <w:sz w:val="19"/>
                 <w:szCs w:val="19"/>
               </w:rPr>
-              <w:t xml:space="preserve"> yours (Requester → Technician → </w:t>
-            </w:r>
-            <w:r>
-              <w:rPr>
-                <w:sz w:val="19"/>
-                <w:szCs w:val="19"/>
-              </w:rPr>
-              <w:t>Supervisor → HOD → Manager → Administrator)</w:t>
-            </w:r>
-            <w:r>
-              <w:rPr>
-                <w:sz w:val="19"/>
-                <w:szCs w:val="19"/>
-              </w:rPr>
-              <w:t xml:space="preserve">. Administrators cannot edit other Administrators, </w:t>
-            </w:r>
-            <w:r>
-              <w:rPr>
-                <w:sz w:val="19"/>
-                <w:szCs w:val="19"/>
-              </w:rPr>
-              <w:t>and only the app developer can create one. Accounts the app developer manages show</w:t>
-            </w:r>
-            <w:r>
-              <w:rPr>
-                <w:sz w:val="19"/>
-                <w:szCs w:val="19"/>
-              </w:rPr>
-              <w:t xml:space="preserve"> "administered only from Supabase" and have no buttons.</w:t>
+              <w:t xml:space="preserve"> yours (Requester → Technician → Supervisor → HOD → Manager → Administrator). Administrators cannot edit other Administrators, and only the app developer can create one. Accounts the app developer manages show "administered only from Supabase" and have no buttons.</w:t>
             </w:r>
           </w:p>
         </w:tc>
@@ -8984,10 +8976,7 @@
         <w:t>Email</w:t>
       </w:r>
       <w:r>
-        <w:t xml:space="preserve"> takes effect immediately — only </w:t>
-      </w:r>
-      <w:r>
-        <w:t xml:space="preserve">the </w:t>
+        <w:t xml:space="preserve"> takes effect immediately — only the </w:t>
       </w:r>
       <w:r>
         <w:rPr>
@@ -8996,10 +8985,7 @@
         <w:t>★</w:t>
       </w:r>
       <w:r>
-        <w:t xml:space="preserve"> app developer</w:t>
-      </w:r>
-      <w:r>
-        <w:t xml:space="preserve"> can do this for other people.</w:t>
+        <w:t xml:space="preserve"> app developer can do this for other people.</w:t>
       </w:r>
     </w:p>
     <w:p>
@@ -9095,10 +9081,7 @@
         <w:spacing w:after="140"/>
       </w:pPr>
       <w:r>
-        <w:t xml:space="preserve">When somebody has forgotten their password, </w:t>
-      </w:r>
-      <w:r>
-        <w:t xml:space="preserve">ask the </w:t>
+        <w:t xml:space="preserve">When somebody has forgotten their password, ask the </w:t>
       </w:r>
       <w:r>
         <w:rPr>
@@ -9107,10 +9090,7 @@
         <w:t>★</w:t>
       </w:r>
       <w:r>
-        <w:t xml:space="preserve"> app developer. They press Password and set a temporary password. Pass it on</w:t>
-      </w:r>
-      <w:r>
-        <w:t xml:space="preserve"> to the person yourself — SI does not send it. They must replace it the next time they sign in, and can do nothing else until they do.</w:t>
+        <w:t xml:space="preserve"> app developer. They press Password and set a temporary password. Pass it on to the person yourself — SI does not send it. They must replace it the next time they sign in, and can do nothing else until they do.</w:t>
       </w:r>
     </w:p>
     <w:p>
@@ -10761,15 +10741,7 @@
                 <w:sz w:val="19"/>
                 <w:szCs w:val="19"/>
               </w:rPr>
-              <w:t xml:space="preserve">Ask </w:t>
-            </w:r>
-            <w:r>
-              <w:rPr>
-                <w:color w:val="4B5563"/>
-                <w:sz w:val="19"/>
-                <w:szCs w:val="19"/>
-              </w:rPr>
-              <w:t xml:space="preserve">the </w:t>
+              <w:t xml:space="preserve">Ask the </w:t>
             </w:r>
             <w:r>
               <w:rPr>
@@ -10786,15 +10758,7 @@
                 <w:sz w:val="19"/>
                 <w:szCs w:val="19"/>
               </w:rPr>
-              <w:t xml:space="preserve"> app developer</w:t>
-            </w:r>
-            <w:r>
-              <w:rPr>
-                <w:color w:val="4B5563"/>
-                <w:sz w:val="19"/>
-                <w:szCs w:val="19"/>
-              </w:rPr>
-              <w:t xml:space="preserve"> to set a temporary password with </w:t>
+              <w:t xml:space="preserve"> app developer to set a temporary password with </w:t>
             </w:r>
             <w:r>
               <w:rPr>
@@ -11240,7 +11204,7 @@
                 <w:sz w:val="19"/>
                 <w:szCs w:val="19"/>
               </w:rPr>
-              <w:t xml:space="preserve"> with a reason. If it just needs more time at the same priority, use </w:t>
+              <w:t xml:space="preserve"> with a reason. If it just needs more time, use </w:t>
             </w:r>
             <w:r>
               <w:rPr>
@@ -11250,7 +11214,7 @@
                 <w:sz w:val="19"/>
                 <w:szCs w:val="19"/>
               </w:rPr>
-              <w:t>Extend SLA → Give it more time</w:t>
+              <w:t>Extend SLA</w:t>
             </w:r>
             <w:r>
               <w:rPr>
@@ -13538,13 +13502,7 @@
         <w:spacing w:after="140"/>
       </w:pPr>
       <w:r>
-        <w:t xml:space="preserve">¹ Unless the account also holds the Requester role.  ² Some actions are </w:t>
-      </w:r>
-      <w:r>
-        <w:t>for the app developer only</w:t>
-      </w:r>
-      <w:r>
-        <w:t xml:space="preserve"> — see the Administrator guide.</w:t>
+        <w:t xml:space="preserve">¹ Unless the account also holds the Requester role.  ² Some actions are for the app developer only — see the Administrator guide.</w:t>
       </w:r>
     </w:p>
     <w:p>
@@ -14009,7 +13967,7 @@
                 <w:sz w:val="18"/>
                 <w:szCs w:val="18"/>
               </w:rPr>
-              <w:t>At risk / Breached</w:t>
+              <w:t>At risk / Breached / Extended</w:t>
             </w:r>
           </w:p>
         </w:tc>
@@ -14030,7 +13988,7 @@
                 <w:sz w:val="18"/>
                 <w:szCs w:val="18"/>
               </w:rPr>
-              <w:t>A stage in its last quarter of time / a stage that ran out of time.</w:t>
+              <w:t>A stage in its last quarter of time / a stage that ran out of time / a stage an Administrator gave more time, while it is within its new deadline.</w:t>
             </w:r>
           </w:p>
         </w:tc>

</xml_diff>